<commit_message>
Describe architecture diagrams in explanatory note
</commit_message>
<xml_diff>
--- a/SportRentSolution/output/doc/Пояснительная записка - дипломный проект мобильное приложение SportRent.docx
+++ b/SportRentSolution/output/doc/Пояснительная записка - дипломный проект мобильное приложение SportRent.docx
@@ -219,7 +219,7 @@
         <w:jc w:val="center"/>
         <w:outlineLvl w:val="0"/>
       </w:pPr>
-      <w:bookmarkStart w:id="0" w:name="_Toc230713192"/>
+      <w:bookmarkStart w:id="0" w:name="_Toc230731318"/>
       <w:r>
         <w:rPr>
           <w:rFonts w:eastAsia="Times New Roman"/>
@@ -255,7 +255,7 @@
       <w:r>
         <w:fldChar w:fldCharType="separate"/>
       </w:r>
-      <w:hyperlink w:anchor="_Toc230713192" w:history="1">
+      <w:hyperlink w:anchor="_Toc230731318" w:history="1">
         <w:r>
           <w:rPr>
             <w:rStyle w:val="ab"/>
@@ -282,7 +282,7 @@
             <w:noProof/>
             <w:webHidden/>
           </w:rPr>
-          <w:instrText xml:space="preserve"> PAGEREF _Toc230713192 \h </w:instrText>
+          <w:instrText xml:space="preserve"> PAGEREF _Toc230731318 \h </w:instrText>
         </w:r>
         <w:r>
           <w:rPr>
@@ -329,7 +329,7 @@
           <w14:ligatures w14:val="standardContextual"/>
         </w:rPr>
       </w:pPr>
-      <w:hyperlink w:anchor="_Toc230713193" w:history="1">
+      <w:hyperlink w:anchor="_Toc230731319" w:history="1">
         <w:r>
           <w:rPr>
             <w:rStyle w:val="ab"/>
@@ -357,7 +357,7 @@
             <w:noProof/>
             <w:webHidden/>
           </w:rPr>
-          <w:instrText xml:space="preserve"> PAGEREF _Toc230713193 \h </w:instrText>
+          <w:instrText xml:space="preserve"> PAGEREF _Toc230731319 \h </w:instrText>
         </w:r>
         <w:r>
           <w:rPr>
@@ -404,7 +404,7 @@
           <w14:ligatures w14:val="standardContextual"/>
         </w:rPr>
       </w:pPr>
-      <w:hyperlink w:anchor="_Toc230713194" w:history="1">
+      <w:hyperlink w:anchor="_Toc230731320" w:history="1">
         <w:r>
           <w:rPr>
             <w:rStyle w:val="ab"/>
@@ -432,7 +432,7 @@
             <w:noProof/>
             <w:webHidden/>
           </w:rPr>
-          <w:instrText xml:space="preserve"> PAGEREF _Toc230713194 \h </w:instrText>
+          <w:instrText xml:space="preserve"> PAGEREF _Toc230731320 \h </w:instrText>
         </w:r>
         <w:r>
           <w:rPr>
@@ -479,7 +479,7 @@
           <w14:ligatures w14:val="standardContextual"/>
         </w:rPr>
       </w:pPr>
-      <w:hyperlink w:anchor="_Toc230713195" w:history="1">
+      <w:hyperlink w:anchor="_Toc230731321" w:history="1">
         <w:r>
           <w:rPr>
             <w:rStyle w:val="ab"/>
@@ -508,7 +508,7 @@
             <w:noProof/>
             <w:webHidden/>
           </w:rPr>
-          <w:instrText xml:space="preserve"> PAGEREF _Toc230713195 \h </w:instrText>
+          <w:instrText xml:space="preserve"> PAGEREF _Toc230731321 \h </w:instrText>
         </w:r>
         <w:r>
           <w:rPr>
@@ -555,7 +555,7 @@
           <w14:ligatures w14:val="standardContextual"/>
         </w:rPr>
       </w:pPr>
-      <w:hyperlink w:anchor="_Toc230713196" w:history="1">
+      <w:hyperlink w:anchor="_Toc230731322" w:history="1">
         <w:r>
           <w:rPr>
             <w:rStyle w:val="ab"/>
@@ -584,7 +584,7 @@
             <w:noProof/>
             <w:webHidden/>
           </w:rPr>
-          <w:instrText xml:space="preserve"> PAGEREF _Toc230713196 \h </w:instrText>
+          <w:instrText xml:space="preserve"> PAGEREF _Toc230731322 \h </w:instrText>
         </w:r>
         <w:r>
           <w:rPr>
@@ -631,7 +631,7 @@
           <w14:ligatures w14:val="standardContextual"/>
         </w:rPr>
       </w:pPr>
-      <w:hyperlink w:anchor="_Toc230713197" w:history="1">
+      <w:hyperlink w:anchor="_Toc230731323" w:history="1">
         <w:r>
           <w:rPr>
             <w:rStyle w:val="ab"/>
@@ -660,7 +660,7 @@
             <w:noProof/>
             <w:webHidden/>
           </w:rPr>
-          <w:instrText xml:space="preserve"> PAGEREF _Toc230713197 \h </w:instrText>
+          <w:instrText xml:space="preserve"> PAGEREF _Toc230731323 \h </w:instrText>
         </w:r>
         <w:r>
           <w:rPr>
@@ -707,7 +707,7 @@
           <w14:ligatures w14:val="standardContextual"/>
         </w:rPr>
       </w:pPr>
-      <w:hyperlink w:anchor="_Toc230713198" w:history="1">
+      <w:hyperlink w:anchor="_Toc230731324" w:history="1">
         <w:r>
           <w:rPr>
             <w:rStyle w:val="ab"/>
@@ -735,7 +735,7 @@
             <w:noProof/>
             <w:webHidden/>
           </w:rPr>
-          <w:instrText xml:space="preserve"> PAGEREF _Toc230713198 \h </w:instrText>
+          <w:instrText xml:space="preserve"> PAGEREF _Toc230731324 \h </w:instrText>
         </w:r>
         <w:r>
           <w:rPr>
@@ -782,7 +782,7 @@
           <w14:ligatures w14:val="standardContextual"/>
         </w:rPr>
       </w:pPr>
-      <w:hyperlink w:anchor="_Toc230713199" w:history="1">
+      <w:hyperlink w:anchor="_Toc230731325" w:history="1">
         <w:r>
           <w:rPr>
             <w:rStyle w:val="ab"/>
@@ -811,7 +811,7 @@
             <w:noProof/>
             <w:webHidden/>
           </w:rPr>
-          <w:instrText xml:space="preserve"> PAGEREF _Toc230713199 \h </w:instrText>
+          <w:instrText xml:space="preserve"> PAGEREF _Toc230731325 \h </w:instrText>
         </w:r>
         <w:r>
           <w:rPr>
@@ -858,7 +858,7 @@
           <w14:ligatures w14:val="standardContextual"/>
         </w:rPr>
       </w:pPr>
-      <w:hyperlink w:anchor="_Toc230713200" w:history="1">
+      <w:hyperlink w:anchor="_Toc230731326" w:history="1">
         <w:r>
           <w:rPr>
             <w:rStyle w:val="ab"/>
@@ -887,7 +887,7 @@
             <w:noProof/>
             <w:webHidden/>
           </w:rPr>
-          <w:instrText xml:space="preserve"> PAGEREF _Toc230713200 \h </w:instrText>
+          <w:instrText xml:space="preserve"> PAGEREF _Toc230731326 \h </w:instrText>
         </w:r>
         <w:r>
           <w:rPr>
@@ -907,7 +907,7 @@
             <w:noProof/>
             <w:webHidden/>
           </w:rPr>
-          <w:t>18</w:t>
+          <w:t>19</w:t>
         </w:r>
         <w:r>
           <w:rPr>
@@ -934,7 +934,7 @@
           <w14:ligatures w14:val="standardContextual"/>
         </w:rPr>
       </w:pPr>
-      <w:hyperlink w:anchor="_Toc230713201" w:history="1">
+      <w:hyperlink w:anchor="_Toc230731327" w:history="1">
         <w:r>
           <w:rPr>
             <w:rStyle w:val="ab"/>
@@ -962,7 +962,7 @@
             <w:noProof/>
             <w:webHidden/>
           </w:rPr>
-          <w:instrText xml:space="preserve"> PAGEREF _Toc230713201 \h </w:instrText>
+          <w:instrText xml:space="preserve"> PAGEREF _Toc230731327 \h </w:instrText>
         </w:r>
         <w:r>
           <w:rPr>
@@ -1009,7 +1009,7 @@
           <w14:ligatures w14:val="standardContextual"/>
         </w:rPr>
       </w:pPr>
-      <w:hyperlink w:anchor="_Toc230713202" w:history="1">
+      <w:hyperlink w:anchor="_Toc230731328" w:history="1">
         <w:r>
           <w:rPr>
             <w:rStyle w:val="ab"/>
@@ -1038,7 +1038,7 @@
             <w:noProof/>
             <w:webHidden/>
           </w:rPr>
-          <w:instrText xml:space="preserve"> PAGEREF _Toc230713202 \h </w:instrText>
+          <w:instrText xml:space="preserve"> PAGEREF _Toc230731328 \h </w:instrText>
         </w:r>
         <w:r>
           <w:rPr>
@@ -1085,7 +1085,7 @@
           <w14:ligatures w14:val="standardContextual"/>
         </w:rPr>
       </w:pPr>
-      <w:hyperlink w:anchor="_Toc230713203" w:history="1">
+      <w:hyperlink w:anchor="_Toc230731329" w:history="1">
         <w:r>
           <w:rPr>
             <w:rStyle w:val="ab"/>
@@ -1114,7 +1114,7 @@
             <w:noProof/>
             <w:webHidden/>
           </w:rPr>
-          <w:instrText xml:space="preserve"> PAGEREF _Toc230713203 \h </w:instrText>
+          <w:instrText xml:space="preserve"> PAGEREF _Toc230731329 \h </w:instrText>
         </w:r>
         <w:r>
           <w:rPr>
@@ -1161,7 +1161,7 @@
           <w14:ligatures w14:val="standardContextual"/>
         </w:rPr>
       </w:pPr>
-      <w:hyperlink w:anchor="_Toc230713204" w:history="1">
+      <w:hyperlink w:anchor="_Toc230731330" w:history="1">
         <w:r>
           <w:rPr>
             <w:rStyle w:val="ab"/>
@@ -1190,7 +1190,7 @@
             <w:noProof/>
             <w:webHidden/>
           </w:rPr>
-          <w:instrText xml:space="preserve"> PAGEREF _Toc230713204 \h </w:instrText>
+          <w:instrText xml:space="preserve"> PAGEREF _Toc230731330 \h </w:instrText>
         </w:r>
         <w:r>
           <w:rPr>
@@ -1237,7 +1237,7 @@
           <w14:ligatures w14:val="standardContextual"/>
         </w:rPr>
       </w:pPr>
-      <w:hyperlink w:anchor="_Toc230713205" w:history="1">
+      <w:hyperlink w:anchor="_Toc230731331" w:history="1">
         <w:r>
           <w:rPr>
             <w:rStyle w:val="ab"/>
@@ -1266,7 +1266,7 @@
             <w:noProof/>
             <w:webHidden/>
           </w:rPr>
-          <w:instrText xml:space="preserve"> PAGEREF _Toc230713205 \h </w:instrText>
+          <w:instrText xml:space="preserve"> PAGEREF _Toc230731331 \h </w:instrText>
         </w:r>
         <w:r>
           <w:rPr>
@@ -1313,7 +1313,7 @@
           <w14:ligatures w14:val="standardContextual"/>
         </w:rPr>
       </w:pPr>
-      <w:hyperlink w:anchor="_Toc230713206" w:history="1">
+      <w:hyperlink w:anchor="_Toc230731332" w:history="1">
         <w:r>
           <w:rPr>
             <w:rStyle w:val="ab"/>
@@ -1342,7 +1342,7 @@
             <w:noProof/>
             <w:webHidden/>
           </w:rPr>
-          <w:instrText xml:space="preserve"> PAGEREF _Toc230713206 \h </w:instrText>
+          <w:instrText xml:space="preserve"> PAGEREF _Toc230731332 \h </w:instrText>
         </w:r>
         <w:r>
           <w:rPr>
@@ -1389,7 +1389,7 @@
           <w14:ligatures w14:val="standardContextual"/>
         </w:rPr>
       </w:pPr>
-      <w:hyperlink w:anchor="_Toc230713207" w:history="1">
+      <w:hyperlink w:anchor="_Toc230731333" w:history="1">
         <w:r>
           <w:rPr>
             <w:rStyle w:val="ab"/>
@@ -1418,7 +1418,7 @@
             <w:noProof/>
             <w:webHidden/>
           </w:rPr>
-          <w:instrText xml:space="preserve"> PAGEREF _Toc230713207 \h </w:instrText>
+          <w:instrText xml:space="preserve"> PAGEREF _Toc230731333 \h </w:instrText>
         </w:r>
         <w:r>
           <w:rPr>
@@ -1465,7 +1465,7 @@
           <w14:ligatures w14:val="standardContextual"/>
         </w:rPr>
       </w:pPr>
-      <w:hyperlink w:anchor="_Toc230713208" w:history="1">
+      <w:hyperlink w:anchor="_Toc230731334" w:history="1">
         <w:r>
           <w:rPr>
             <w:rStyle w:val="ab"/>
@@ -1493,7 +1493,7 @@
             <w:noProof/>
             <w:webHidden/>
           </w:rPr>
-          <w:instrText xml:space="preserve"> PAGEREF _Toc230713208 \h </w:instrText>
+          <w:instrText xml:space="preserve"> PAGEREF _Toc230731334 \h </w:instrText>
         </w:r>
         <w:r>
           <w:rPr>
@@ -1540,7 +1540,7 @@
           <w14:ligatures w14:val="standardContextual"/>
         </w:rPr>
       </w:pPr>
-      <w:hyperlink w:anchor="_Toc230713209" w:history="1">
+      <w:hyperlink w:anchor="_Toc230731335" w:history="1">
         <w:r>
           <w:rPr>
             <w:rStyle w:val="ab"/>
@@ -1569,7 +1569,7 @@
             <w:noProof/>
             <w:webHidden/>
           </w:rPr>
-          <w:instrText xml:space="preserve"> PAGEREF _Toc230713209 \h </w:instrText>
+          <w:instrText xml:space="preserve"> PAGEREF _Toc230731335 \h </w:instrText>
         </w:r>
         <w:r>
           <w:rPr>
@@ -1616,7 +1616,7 @@
           <w14:ligatures w14:val="standardContextual"/>
         </w:rPr>
       </w:pPr>
-      <w:hyperlink w:anchor="_Toc230713210" w:history="1">
+      <w:hyperlink w:anchor="_Toc230731336" w:history="1">
         <w:r>
           <w:rPr>
             <w:rStyle w:val="ab"/>
@@ -1645,7 +1645,7 @@
             <w:noProof/>
             <w:webHidden/>
           </w:rPr>
-          <w:instrText xml:space="preserve"> PAGEREF _Toc230713210 \h </w:instrText>
+          <w:instrText xml:space="preserve"> PAGEREF _Toc230731336 \h </w:instrText>
         </w:r>
         <w:r>
           <w:rPr>
@@ -1692,7 +1692,7 @@
           <w14:ligatures w14:val="standardContextual"/>
         </w:rPr>
       </w:pPr>
-      <w:hyperlink w:anchor="_Toc230713211" w:history="1">
+      <w:hyperlink w:anchor="_Toc230731337" w:history="1">
         <w:r>
           <w:rPr>
             <w:rStyle w:val="ab"/>
@@ -1720,7 +1720,7 @@
             <w:noProof/>
             <w:webHidden/>
           </w:rPr>
-          <w:instrText xml:space="preserve"> PAGEREF _Toc230713211 \h </w:instrText>
+          <w:instrText xml:space="preserve"> PAGEREF _Toc230731337 \h </w:instrText>
         </w:r>
         <w:r>
           <w:rPr>
@@ -1767,7 +1767,7 @@
           <w14:ligatures w14:val="standardContextual"/>
         </w:rPr>
       </w:pPr>
-      <w:hyperlink w:anchor="_Toc230713212" w:history="1">
+      <w:hyperlink w:anchor="_Toc230731338" w:history="1">
         <w:r>
           <w:rPr>
             <w:rStyle w:val="ab"/>
@@ -1795,7 +1795,7 @@
             <w:noProof/>
             <w:webHidden/>
           </w:rPr>
-          <w:instrText xml:space="preserve"> PAGEREF _Toc230713212 \h </w:instrText>
+          <w:instrText xml:space="preserve"> PAGEREF _Toc230731338 \h </w:instrText>
         </w:r>
         <w:r>
           <w:rPr>
@@ -1855,7 +1855,7 @@
         <w:jc w:val="center"/>
         <w:outlineLvl w:val="0"/>
       </w:pPr>
-      <w:bookmarkStart w:id="1" w:name="_Toc230713193"/>
+      <w:bookmarkStart w:id="1" w:name="_Toc230731319"/>
       <w:r>
         <w:rPr>
           <w:rFonts w:eastAsia="Times New Roman"/>
@@ -2041,7 +2041,7 @@
         <w:jc w:val="center"/>
         <w:outlineLvl w:val="0"/>
       </w:pPr>
-      <w:bookmarkStart w:id="2" w:name="_Toc230713194"/>
+      <w:bookmarkStart w:id="2" w:name="_Toc230731320"/>
       <w:r>
         <w:rPr>
           <w:rFonts w:eastAsia="Times New Roman"/>
@@ -2060,7 +2060,7 @@
         <w:jc w:val="left"/>
         <w:outlineLvl w:val="1"/>
       </w:pPr>
-      <w:bookmarkStart w:id="3" w:name="_Toc230713195"/>
+      <w:bookmarkStart w:id="3" w:name="_Toc230731321"/>
       <w:r>
         <w:rPr>
           <w:rFonts w:eastAsia="Times New Roman"/>
@@ -2113,7 +2113,7 @@
         <w:jc w:val="left"/>
         <w:outlineLvl w:val="1"/>
       </w:pPr>
-      <w:bookmarkStart w:id="4" w:name="_Toc230713196"/>
+      <w:bookmarkStart w:id="4" w:name="_Toc230731322"/>
       <w:r>
         <w:rPr>
           <w:rFonts w:eastAsia="Times New Roman"/>
@@ -2179,7 +2179,7 @@
         <w:jc w:val="left"/>
         <w:outlineLvl w:val="1"/>
       </w:pPr>
-      <w:bookmarkStart w:id="5" w:name="_Toc230713197"/>
+      <w:bookmarkStart w:id="5" w:name="_Toc230731323"/>
       <w:r>
         <w:rPr>
           <w:rFonts w:eastAsia="Times New Roman"/>
@@ -2674,7 +2674,7 @@
         <w:jc w:val="center"/>
         <w:outlineLvl w:val="0"/>
       </w:pPr>
-      <w:bookmarkStart w:id="6" w:name="_Toc230713198"/>
+      <w:bookmarkStart w:id="6" w:name="_Toc230731324"/>
       <w:r>
         <w:rPr>
           <w:rFonts w:eastAsia="Times New Roman"/>
@@ -2693,7 +2693,7 @@
         <w:jc w:val="left"/>
         <w:outlineLvl w:val="1"/>
       </w:pPr>
-      <w:bookmarkStart w:id="7" w:name="_Toc230713199"/>
+      <w:bookmarkStart w:id="7" w:name="_Toc230731325"/>
       <w:r>
         <w:rPr>
           <w:rFonts w:eastAsia="Times New Roman"/>
@@ -14672,14 +14672,47 @@
     <w:p>
       <w:pPr>
         <w:pStyle w:val="a5"/>
-      </w:pPr>
-      <w:r>
         <w:rPr>
           <w:rFonts w:eastAsia="Times New Roman"/>
           <w:color w:val="000000"/>
+          <w:lang w:val="en-US"/>
+        </w:rPr>
+      </w:pPr>
+      <w:r>
+        <w:rPr>
+          <w:rFonts w:eastAsia="Times New Roman"/>
+          <w:color w:val="000000"/>
         </w:rPr>
         <w:t>Представленная детализация фиксирует не только перечень сущностей, но и состав их полей, типы данных, обязательность заполнения и внешние ключи. Это делает описание базы данных в записке согласованным с фактической SQLite-схемой проекта и удобным для последующей доработки приложения.</w:t>
       </w:r>
+    </w:p>
+    <w:p>
+      <w:pPr>
+        <w:pStyle w:val="a5"/>
+        <w:rPr>
+          <w:rFonts w:eastAsia="Times New Roman"/>
+          <w:color w:val="000000"/>
+          <w:lang w:val="en-US"/>
+        </w:rPr>
+      </w:pPr>
+    </w:p>
+    <w:p>
+      <w:pPr>
+        <w:pStyle w:val="a5"/>
+        <w:rPr>
+          <w:rFonts w:eastAsia="Times New Roman"/>
+          <w:color w:val="000000"/>
+          <w:lang w:val="en-US"/>
+        </w:rPr>
+      </w:pPr>
+    </w:p>
+    <w:p>
+      <w:pPr>
+        <w:pStyle w:val="a5"/>
+        <w:rPr>
+          <w:lang w:val="en-US"/>
+        </w:rPr>
+      </w:pPr>
     </w:p>
     <w:p>
       <w:pPr>
@@ -14687,13 +14720,14 @@
         <w:jc w:val="left"/>
         <w:outlineLvl w:val="1"/>
       </w:pPr>
-      <w:bookmarkStart w:id="8" w:name="_Toc230713200"/>
+      <w:bookmarkStart w:id="8" w:name="_Toc230731326"/>
       <w:r>
         <w:rPr>
           <w:rFonts w:eastAsia="Times New Roman"/>
           <w:b/>
           <w:color w:val="000000"/>
         </w:rPr>
+        <w:lastRenderedPageBreak/>
         <w:t>2.2 Проектирование архитектуры решения</w:t>
       </w:r>
       <w:bookmarkEnd w:id="8"/>
@@ -14703,7 +14737,6 @@
         <w:pStyle w:val="a5"/>
       </w:pPr>
       <w:r>
-        <w:lastRenderedPageBreak/>
         <w:t>Решение состоит из трех логически разделенных проектов. Такое разделение позволяет обособить задачи построения базы данных, работы со scaffolded сущностями и разработки пользовательского интерфейса [4; 6].</w:t>
       </w:r>
     </w:p>
@@ -15043,6 +15076,7 @@
           <w:rFonts w:eastAsia="Times New Roman"/>
           <w:sz w:val="28"/>
         </w:rPr>
+        <w:lastRenderedPageBreak/>
         <w:t>Таблица 24. Целевые платформы единой кодовой базы MAUI</w:t>
       </w:r>
     </w:p>
@@ -15083,7 +15117,6 @@
                 <w:color w:val="000000"/>
                 <w:sz w:val="24"/>
               </w:rPr>
-              <w:lastRenderedPageBreak/>
               <w:t>Цель сборки</w:t>
             </w:r>
           </w:p>
@@ -15327,21 +15360,17 @@
     <w:p>
       <w:pPr>
         <w:pStyle w:val="a5"/>
-        <w:jc w:val="left"/>
-      </w:pPr>
+      </w:pPr>
+      <w:r>
+        <w:t>Для детализации архитектуры решения разработаны диаграммы вариантов использования, классов, функциональная модель IDEF0 и диаграмма потоков данных DFD. Они уточняют состав участников, структуру предметных сущностей, функции приложения и движение данных между интерфейсом, сервисами и локальной базой данных.</w:t>
+      </w:r>
     </w:p>
     <w:p>
-      <w:r>
-        <w:br w:type="page"/>
-      </w:r>
-    </w:p>
-    <w:p>
       <w:pPr>
         <w:pStyle w:val="a5"/>
       </w:pPr>
       <w:r>
-        <w:lastRenderedPageBreak/>
-        <w:t>Для детализации архитектуры решения разработаны диаграммы вариантов использования, классов, функциональная модель IDEF0 и диаграмма потоков данных DFD. Они уточняют состав участников, структуру предметных сущностей, функции приложения и движение данных между интерфейсом, сервисами и локальной базой данных.</w:t>
+        <w:t>Диаграмма вариантов использования на рис. 2 фиксирует границы мобильного приложения и основные роли, участвующие в работе системы. Клиент выполняет авторизацию, просматривает каталог, открывает карточку инвентаря, оформляет аренду, выполняет мок-оплату заказа и обращается к истории заказов и профилю. Администратор данных в рамках учебного проекта представлен как участник, отвечающий за подготовку локальной базы данных.</w:t>
       </w:r>
     </w:p>
     <w:p>
@@ -15399,7 +15428,16 @@
         <w:rPr>
           <w:rFonts w:eastAsia="Times New Roman"/>
         </w:rPr>
+        <w:lastRenderedPageBreak/>
         <w:t>Рис. 2. Диаграмма вариантов использования SportRent</w:t>
+      </w:r>
+    </w:p>
+    <w:p>
+      <w:pPr>
+        <w:pStyle w:val="a5"/>
+      </w:pPr>
+      <w:r>
+        <w:t>Диаграмма классов на рис. 3 показывает ключевые сущности предметной области и связи между ними. В центре модели расположен заказ аренды RentOrder, связанный с пользователем, позициями заказа, платежами, инвентарем, тарифами и остатками в пунктах проката. Такая схема объясняет, какие классы и таблицы обеспечивают оформление заказа и последующее отображение истории аренды.</w:t>
       </w:r>
     </w:p>
     <w:p>
@@ -15457,19 +15495,27 @@
         <w:rPr>
           <w:rFonts w:eastAsia="Times New Roman"/>
         </w:rPr>
-        <w:lastRenderedPageBreak/>
         <w:t>Рис. 3. Диаграмма классов предметной области SportRent</w:t>
       </w:r>
     </w:p>
     <w:p>
       <w:pPr>
         <w:pStyle w:val="a5"/>
+      </w:pPr>
+      <w:r>
+        <w:t>Функциональная модель IDEF0 на рис. 4 описывает процесс аренды как единую функцию управления прокатом спортивного инвентаря. На вход поступают запрос аренды и данные пользователя, управляющими воздействиями выступают правила тарификации, остатки и статусы, а механизмами реализации являются MAUI-приложение, локальная SQLite-база и сервисный слой. Декомпозиция A1-A5 показывает последовательность от авторизации до регистрации оплаты.</w:t>
+      </w:r>
+    </w:p>
+    <w:p>
+      <w:pPr>
+        <w:pStyle w:val="a5"/>
         <w:jc w:val="center"/>
       </w:pPr>
       <w:r>
         <w:rPr>
           <w:noProof/>
         </w:rPr>
+        <w:lastRenderedPageBreak/>
         <w:drawing>
           <wp:inline distT="0" distB="0" distL="0" distR="0" wp14:anchorId="280A991E" wp14:editId="39A0E5CC">
             <wp:extent cx="5715000" cy="3333750"/>
@@ -15523,13 +15569,21 @@
       <w:pPr>
         <w:pStyle w:val="a5"/>
         <w:pageBreakBefore/>
+      </w:pPr>
+      <w:r>
+        <w:lastRenderedPageBreak/>
+        <w:t>Диаграмма потоков данных на рис. 5 уточняет движение информации между клиентом, процессами приложения и локальными хранилищами данных. Потоки показывают передачу логина и сессии, чтение каталога, выбор позиции, запись заказа и платежа, обновление остатков и возврат данных для экранов истории и профиля. Такая модель дополняет IDEF0, так как акцентирует внимание не на функциях, а на маршрутах данных внутри решения.</w:t>
+      </w:r>
+    </w:p>
+    <w:p>
+      <w:pPr>
+        <w:pStyle w:val="a5"/>
         <w:jc w:val="center"/>
       </w:pPr>
       <w:r>
         <w:rPr>
           <w:noProof/>
         </w:rPr>
-        <w:lastRenderedPageBreak/>
         <w:drawing>
           <wp:inline distT="0" distB="0" distL="0" distR="0" wp14:anchorId="6C9C8B0A" wp14:editId="4C8EE6DC">
             <wp:extent cx="5715000" cy="2857500"/>
@@ -15586,7 +15640,7 @@
         <w:jc w:val="center"/>
         <w:outlineLvl w:val="0"/>
       </w:pPr>
-      <w:bookmarkStart w:id="9" w:name="_Toc230713201"/>
+      <w:bookmarkStart w:id="9" w:name="_Toc230731327"/>
       <w:r>
         <w:rPr>
           <w:rFonts w:eastAsia="Times New Roman"/>
@@ -15605,7 +15659,7 @@
         <w:jc w:val="left"/>
         <w:outlineLvl w:val="1"/>
       </w:pPr>
-      <w:bookmarkStart w:id="10" w:name="_Toc230713202"/>
+      <w:bookmarkStart w:id="10" w:name="_Toc230731328"/>
       <w:r>
         <w:rPr>
           <w:rFonts w:eastAsia="Times New Roman"/>
@@ -15666,7 +15720,7 @@
         <w:jc w:val="left"/>
         <w:outlineLvl w:val="1"/>
       </w:pPr>
-      <w:bookmarkStart w:id="11" w:name="_Toc230713203"/>
+      <w:bookmarkStart w:id="11" w:name="_Toc230731329"/>
       <w:r>
         <w:rPr>
           <w:rFonts w:eastAsia="Times New Roman"/>
@@ -16172,7 +16226,7 @@
         <w:jc w:val="left"/>
         <w:outlineLvl w:val="1"/>
       </w:pPr>
-      <w:bookmarkStart w:id="12" w:name="_Toc230713204"/>
+      <w:bookmarkStart w:id="12" w:name="_Toc230731330"/>
       <w:r>
         <w:rPr>
           <w:rFonts w:eastAsia="Times New Roman"/>
@@ -16190,7 +16244,7 @@
         <w:jc w:val="left"/>
         <w:outlineLvl w:val="1"/>
       </w:pPr>
-      <w:bookmarkStart w:id="13" w:name="_Toc230713205"/>
+      <w:bookmarkStart w:id="13" w:name="_Toc230731331"/>
       <w:r>
         <w:rPr>
           <w:rFonts w:eastAsia="Times New Roman"/>
@@ -16243,7 +16297,7 @@
         <w:jc w:val="left"/>
         <w:outlineLvl w:val="1"/>
       </w:pPr>
-      <w:bookmarkStart w:id="14" w:name="_Toc230713206"/>
+      <w:bookmarkStart w:id="14" w:name="_Toc230731332"/>
       <w:r>
         <w:rPr>
           <w:rFonts w:eastAsia="Times New Roman"/>
@@ -16297,7 +16351,7 @@
         <w:jc w:val="left"/>
         <w:outlineLvl w:val="1"/>
       </w:pPr>
-      <w:bookmarkStart w:id="15" w:name="_Toc230713207"/>
+      <w:bookmarkStart w:id="15" w:name="_Toc230731333"/>
       <w:r>
         <w:rPr>
           <w:rFonts w:eastAsia="Times New Roman"/>
@@ -16416,7 +16470,7 @@
         <w:jc w:val="center"/>
         <w:outlineLvl w:val="0"/>
       </w:pPr>
-      <w:bookmarkStart w:id="16" w:name="_Toc230713208"/>
+      <w:bookmarkStart w:id="16" w:name="_Toc230731334"/>
       <w:r>
         <w:rPr>
           <w:rFonts w:eastAsia="Times New Roman"/>
@@ -16435,7 +16489,7 @@
         <w:jc w:val="left"/>
         <w:outlineLvl w:val="1"/>
       </w:pPr>
-      <w:bookmarkStart w:id="17" w:name="_Toc230713209"/>
+      <w:bookmarkStart w:id="17" w:name="_Toc230731335"/>
       <w:r>
         <w:rPr>
           <w:rFonts w:eastAsia="Times New Roman"/>
@@ -17043,7 +17097,7 @@
         <w:jc w:val="left"/>
         <w:outlineLvl w:val="1"/>
       </w:pPr>
-      <w:bookmarkStart w:id="18" w:name="_Toc230713210"/>
+      <w:bookmarkStart w:id="18" w:name="_Toc230731336"/>
       <w:r>
         <w:rPr>
           <w:rFonts w:eastAsia="Times New Roman"/>
@@ -17614,7 +17668,7 @@
         <w:jc w:val="center"/>
         <w:outlineLvl w:val="0"/>
       </w:pPr>
-      <w:bookmarkStart w:id="19" w:name="_Toc230713211"/>
+      <w:bookmarkStart w:id="19" w:name="_Toc230731337"/>
       <w:r>
         <w:rPr>
           <w:rFonts w:eastAsia="Times New Roman"/>
@@ -17710,7 +17764,7 @@
         <w:jc w:val="center"/>
         <w:outlineLvl w:val="0"/>
       </w:pPr>
-      <w:bookmarkStart w:id="20" w:name="_Toc230713212"/>
+      <w:bookmarkStart w:id="20" w:name="_Toc230731338"/>
       <w:r>
         <w:rPr>
           <w:rFonts w:eastAsia="Times New Roman"/>
@@ -17848,12 +17902,28 @@
     <w:p>
       <w:pPr>
         <w:pStyle w:val="a5"/>
+        <w:rPr>
+          <w:lang w:val="en-US"/>
+        </w:rPr>
       </w:pPr>
       <w:r>
         <w:rPr>
           <w:b/>
         </w:rPr>
-        <w:t>Электронные ресурсы</w:t>
+        <w:t>Электронные</w:t>
+      </w:r>
+      <w:r>
+        <w:rPr>
+          <w:b/>
+          <w:lang w:val="en-US"/>
+        </w:rPr>
+        <w:t xml:space="preserve"> </w:t>
+      </w:r>
+      <w:r>
+        <w:rPr>
+          <w:b/>
+        </w:rPr>
+        <w:t>ресурсы</w:t>
       </w:r>
     </w:p>
     <w:p>
@@ -17861,15 +17931,63 @@
         <w:pStyle w:val="a5"/>
       </w:pPr>
       <w:r>
-        <w:t>12. Microsoft Learn. What is .NET MAUI? [Электронный ресурс]. – URL: https://learn.microsoft.com/en-us/dotnet/maui/what-is-maui (дата обращения: 26.05.2026).</w:t>
+        <w:rPr>
+          <w:lang w:val="en-US"/>
+        </w:rPr>
+        <w:t xml:space="preserve">12. Microsoft Learn. What is .NET MAUI? </w:t>
+      </w:r>
+      <w:r>
+        <w:t>[Электронный ресурс]. – URL: https://learn.microsoft.com/en-us/dotnet/maui/what-is-maui (дата обращения: 26.05.2026).</w:t>
       </w:r>
     </w:p>
     <w:p>
       <w:pPr>
         <w:pStyle w:val="a5"/>
-      </w:pPr>
-      <w:r>
-        <w:t>13. Microsoft Learn. Overview of Entity Framework Core [Электронный ресурс]. – URL: https://learn.microsoft.com/en-us/ef/core/ (дата обращения: 26.05.2026).</w:t>
+        <w:rPr>
+          <w:lang w:val="en-US"/>
+        </w:rPr>
+      </w:pPr>
+      <w:r>
+        <w:rPr>
+          <w:lang w:val="en-US"/>
+        </w:rPr>
+        <w:t>13. Microsoft Learn. Overview of Entity Framework Core [</w:t>
+      </w:r>
+      <w:r>
+        <w:t>Электронный</w:t>
+      </w:r>
+      <w:r>
+        <w:rPr>
+          <w:lang w:val="en-US"/>
+        </w:rPr>
+        <w:t xml:space="preserve"> </w:t>
+      </w:r>
+      <w:r>
+        <w:t>ресурс</w:t>
+      </w:r>
+      <w:r>
+        <w:rPr>
+          <w:lang w:val="en-US"/>
+        </w:rPr>
+        <w:t>]. – URL: https://learn.microsoft.com/en-us/ef/core/ (</w:t>
+      </w:r>
+      <w:r>
+        <w:t>дата</w:t>
+      </w:r>
+      <w:r>
+        <w:rPr>
+          <w:lang w:val="en-US"/>
+        </w:rPr>
+        <w:t xml:space="preserve"> </w:t>
+      </w:r>
+      <w:r>
+        <w:t>обращения</w:t>
+      </w:r>
+      <w:r>
+        <w:rPr>
+          <w:lang w:val="en-US"/>
+        </w:rPr>
+        <w:t>: 26.05.2026).</w:t>
       </w:r>
     </w:p>
     <w:p>
@@ -22919,7 +23037,43 @@
           <w:color w:val="000000"/>
           <w:lang w:val="en-US"/>
         </w:rPr>
-        <w:t xml:space="preserve"> (SportRentCatalogService.cs)</w:t>
+        <w:t xml:space="preserve"> (</w:t>
+      </w:r>
+      <w:r>
+        <w:rPr>
+          <w:rFonts w:eastAsia="Times New Roman"/>
+          <w:b/>
+          <w:color w:val="000000"/>
+          <w:lang w:val="en-US"/>
+        </w:rPr>
+        <w:t>SportRentCatalogService</w:t>
+      </w:r>
+      <w:r>
+        <w:rPr>
+          <w:rFonts w:eastAsia="Times New Roman"/>
+          <w:b/>
+          <w:color w:val="000000"/>
+          <w:lang w:val="en-US"/>
+        </w:rPr>
+        <w:t>.</w:t>
+      </w:r>
+      <w:r>
+        <w:rPr>
+          <w:rFonts w:eastAsia="Times New Roman"/>
+          <w:b/>
+          <w:color w:val="000000"/>
+          <w:lang w:val="en-US"/>
+        </w:rPr>
+        <w:t>cs</w:t>
+      </w:r>
+      <w:r>
+        <w:rPr>
+          <w:rFonts w:eastAsia="Times New Roman"/>
+          <w:b/>
+          <w:color w:val="000000"/>
+          <w:lang w:val="en-US"/>
+        </w:rPr>
+        <w:t>)</w:t>
       </w:r>
     </w:p>
     <w:p>
@@ -26733,7 +26887,43 @@
           <w:color w:val="000000"/>
           <w:lang w:val="en-US"/>
         </w:rPr>
-        <w:t xml:space="preserve"> (OrdersService.cs)</w:t>
+        <w:t xml:space="preserve"> (</w:t>
+      </w:r>
+      <w:r>
+        <w:rPr>
+          <w:rFonts w:eastAsia="Times New Roman"/>
+          <w:b/>
+          <w:color w:val="000000"/>
+          <w:lang w:val="en-US"/>
+        </w:rPr>
+        <w:t>OrdersService</w:t>
+      </w:r>
+      <w:r>
+        <w:rPr>
+          <w:rFonts w:eastAsia="Times New Roman"/>
+          <w:b/>
+          <w:color w:val="000000"/>
+          <w:lang w:val="en-US"/>
+        </w:rPr>
+        <w:t>.</w:t>
+      </w:r>
+      <w:r>
+        <w:rPr>
+          <w:rFonts w:eastAsia="Times New Roman"/>
+          <w:b/>
+          <w:color w:val="000000"/>
+          <w:lang w:val="en-US"/>
+        </w:rPr>
+        <w:t>cs</w:t>
+      </w:r>
+      <w:r>
+        <w:rPr>
+          <w:rFonts w:eastAsia="Times New Roman"/>
+          <w:b/>
+          <w:color w:val="000000"/>
+          <w:lang w:val="en-US"/>
+        </w:rPr>
+        <w:t>)</w:t>
       </w:r>
     </w:p>
     <w:p>

</xml_diff>